<commit_message>
Update Workload ModelFull Description.docx to v2
</commit_message>
<xml_diff>
--- a/Workload ModelFull Description.docx
+++ b/Workload ModelFull Description.docx
@@ -1614,7 +1614,13 @@
           <w:rFonts w:ascii="Arial" w:cs="Arial" w:eastAsia="Arial" w:hAnsi="Arial"/>
           <w:rtl w:val="0"/>
         </w:rPr>
-        <w:t xml:space="preserve">New lecturer for a new lecture = 7.5</w:t>
+        <w:t>New lecturer for a new lecture = 5</w:t>
+      </w:r>
+      <w:r>
+        <w:rPr>
+          <w:color w:val="FF0000"/>
+        </w:rPr>
+        <w:t xml:space="preserve"> (was 7.5)</w:t>
       </w:r>
     </w:p>
     <w:p>
@@ -1776,13 +1782,6 @@
           <w:rFonts w:ascii="Arial" w:cs="Arial" w:eastAsia="Arial" w:hAnsi="Arial"/>
         </w:rPr>
       </w:pPr>
-      <w:r>
-        <w:rPr>
-          <w:rFonts w:ascii="Arial" w:cs="Arial" w:eastAsia="Arial" w:hAnsi="Arial"/>
-          <w:rtl w:val="0"/>
-        </w:rPr>
-        <w:t xml:space="preserve">For each repetition of an identical class (e.g. the 2nd and 3rd version of a practical session) have a multiplier of 1.5 times contact duration</w:t>
-      </w:r>
     </w:p>
     <w:p>
       <w:pPr>
@@ -1799,26 +1798,6 @@
           <w:rFonts w:ascii="Arial" w:cs="Arial" w:eastAsia="Arial" w:hAnsi="Arial"/>
         </w:rPr>
       </w:pPr>
-      <w:r>
-        <w:rPr>
-          <w:rFonts w:ascii="Arial" w:cs="Arial" w:eastAsia="Arial" w:hAnsi="Arial"/>
-          <w:rtl w:val="0"/>
-        </w:rPr>
-        <w:t xml:space="preserve">Example: A new two-hour lecture which is delivered twice : 5 * 2 hours + 1.5 * 2 hours = 13 hours. Or an existing two-hour practical session delivered three times: 2.5 * 2 hours + 2*1.5*2 hours = 1</w:t>
-      </w:r>
-      <w:r>
-        <w:rPr>
-          <w:rtl w:val="0"/>
-        </w:rPr>
-        <w:t xml:space="preserve">1</w:t>
-      </w:r>
-      <w:r>
-        <w:rPr>
-          <w:rFonts w:ascii="Arial" w:cs="Arial" w:eastAsia="Arial" w:hAnsi="Arial"/>
-          <w:rtl w:val="0"/>
-        </w:rPr>
-        <w:t xml:space="preserve"> hours.</w:t>
-      </w:r>
     </w:p>
     <w:p>
       <w:pPr>
@@ -3719,7 +3698,7 @@
           <w:rFonts w:ascii="Arial" w:cs="Arial" w:eastAsia="Arial" w:hAnsi="Arial"/>
           <w:rtl w:val="0"/>
         </w:rPr>
-        <w:t xml:space="preserve">Ethics, 5%</w:t>
+        <w:t>Ethics (Chair), 5%</w:t>
       </w:r>
     </w:p>
     <w:p>
@@ -5140,6 +5119,54 @@
           <w:rtl w:val="0"/>
         </w:rPr>
         <w:t xml:space="preserve">This is a refinement of the Physics model and one that we should aim to uphold.</w:t>
+      </w:r>
+    </w:p>
+    <w:p>
+      <w:r>
+        <w:rPr>
+          <w:color w:val="FF0000"/>
+        </w:rPr>
+        <w:t>Co-supervisor = 48 hours per year per FTE student (60% of primary supervisor rate)</w:t>
+      </w:r>
+    </w:p>
+    <w:p>
+      <w:r>
+        <w:rPr>
+          <w:color w:val="FF0000"/>
+        </w:rPr>
+        <w:t>Note: This is assigned independently (not equivalent to Chair of BoE). Chair = Jen Beeston.</w:t>
+      </w:r>
+    </w:p>
+    <w:p>
+      <w:r>
+        <w:rPr>
+          <w:color w:val="FF0000"/>
+        </w:rPr>
+        <w:t>Ethics Committee members = 10% each (changed from 5% — Iain Bate, June 2026)</w:t>
+      </w:r>
+    </w:p>
+    <w:p>
+      <w:r>
+        <w:rPr>
+          <w:color w:val="FF0000"/>
+        </w:rPr>
+        <w:t>ECR rep = no percentage (0%). ART staff rep = no percentage (0%).</w:t>
+      </w:r>
+    </w:p>
+    <w:p>
+      <w:r>
+        <w:rPr>
+          <w:color w:val="FF0000"/>
+        </w:rPr>
+        <w:t>Part-time staff: nominal hours, all baselines (engagement, project setting, personal development, research baseline) scale by FTE percentage. Contract normative divisions still apply to the FTE-adjusted nominal hours.</w:t>
+      </w:r>
+    </w:p>
+    <w:p>
+      <w:r>
+        <w:rPr>
+          <w:color w:val="FF0000"/>
+        </w:rPr>
+        <w:t>Personal development baseline (75h) applies to all staff, scaled by FTE for part-time staff.</w:t>
       </w:r>
     </w:p>
     <w:sectPr>

</xml_diff>

<commit_message>
Update Workload ModelFull Description.docx to v3 (final)
</commit_message>
<xml_diff>
--- a/Workload ModelFull Description.docx
+++ b/Workload ModelFull Description.docx
@@ -1782,6 +1782,13 @@
           <w:rFonts w:ascii="Arial" w:cs="Arial" w:eastAsia="Arial" w:hAnsi="Arial"/>
         </w:rPr>
       </w:pPr>
+      <w:r>
+        <w:rPr>
+          <w:rFonts w:ascii="Arial" w:cs="Arial" w:eastAsia="Arial" w:hAnsi="Arial"/>
+          <w:rtl w:val="0"/>
+        </w:rPr>
+        <w:t xml:space="preserve">For each repetition of an identical class (e.g. the 2nd and 3rd version of a practical session) have a multiplier of 1.5 times contact duration</w:t>
+      </w:r>
     </w:p>
     <w:p>
       <w:pPr>
@@ -5126,6 +5133,14 @@
         <w:rPr>
           <w:color w:val="FF0000"/>
         </w:rPr>
+        <w:t>For each repetition of an identical practical session (e.g. the 2nd and 3rd version), apply a multiplier of 1.5 times contact duration. The first practical session uses the standard multiplier (2.5x for existing, 5x for new content).</w:t>
+      </w:r>
+    </w:p>
+    <w:p>
+      <w:r>
+        <w:rPr>
+          <w:color w:val="FF0000"/>
+        </w:rPr>
         <w:t>Co-supervisor = 48 hours per year per FTE student (60% of primary supervisor rate)</w:t>
       </w:r>
     </w:p>
@@ -5134,6 +5149,14 @@
         <w:rPr>
           <w:color w:val="FF0000"/>
         </w:rPr>
+        <w:t>Research Group Leader, 10%</w:t>
+      </w:r>
+    </w:p>
+    <w:p>
+      <w:r>
+        <w:rPr>
+          <w:color w:val="FF0000"/>
+        </w:rPr>
         <w:t>Note: This is assigned independently (not equivalent to Chair of BoE). Chair = Jen Beeston.</w:t>
       </w:r>
     </w:p>
@@ -5142,7 +5165,7 @@
         <w:rPr>
           <w:color w:val="FF0000"/>
         </w:rPr>
-        <w:t>Ethics Committee members = 10% each (changed from 5% — Iain Bate, June 2026)</w:t>
+        <w:t>Ethics Committee members = 10% each (changed from 5% — Iain Bate, July 2026)</w:t>
       </w:r>
     </w:p>
     <w:p>

</xml_diff>